<commit_message>
adicionar itens, artefatos e inimigos no GDD
</commit_message>
<xml_diff>
--- a/ROGUELIKE.docx
+++ b/ROGUELIKE.docx
@@ -83,15 +83,7 @@
           <w:sz w:val="18"/>
           <w:szCs w:val="18"/>
         </w:rPr>
-        <w:t xml:space="preserve">combate, </w:t>
-      </w:r>
-      <w:r>
-        <w:rPr>
-          <w:rFonts w:ascii="Arial Black" w:hAnsi="Arial Black"/>
-          <w:sz w:val="18"/>
-          <w:szCs w:val="18"/>
-        </w:rPr>
-        <w:t xml:space="preserve">principal forma de interação é derrotar inimigos para passar de </w:t>
+        <w:t xml:space="preserve">combate, principal forma de interação é derrotar inimigos para passar de </w:t>
       </w:r>
       <w:r>
         <w:rPr>
@@ -180,23 +172,7 @@
           <w:sz w:val="18"/>
           <w:szCs w:val="18"/>
         </w:rPr>
-        <w:t xml:space="preserve"> chamado Blitz que procura derrotar o seu Arqu</w:t>
-      </w:r>
-      <w:r>
-        <w:rPr>
-          <w:rFonts w:ascii="Arial Black" w:hAnsi="Arial Black"/>
-          <w:sz w:val="18"/>
-          <w:szCs w:val="18"/>
-        </w:rPr>
-        <w:t>i</w:t>
-      </w:r>
-      <w:r>
-        <w:rPr>
-          <w:rFonts w:ascii="Arial Black" w:hAnsi="Arial Black"/>
-          <w:sz w:val="18"/>
-          <w:szCs w:val="18"/>
-        </w:rPr>
-        <w:t xml:space="preserve">-Inimigo; A </w:t>
+        <w:t xml:space="preserve"> chamado Blitz que procura derrotar o seu Arqui-Inimigo; A </w:t>
       </w:r>
       <w:r>
         <w:rPr>
@@ -233,23 +209,7 @@
         <w:t>.</w:t>
         <w:br/>
         <w:br/>
-        <w:t xml:space="preserve">O protagonista foi arremessado </w:t>
-      </w:r>
-      <w:r>
-        <w:rPr>
-          <w:rFonts w:ascii="Arial Black" w:hAnsi="Arial Black"/>
-          <w:sz w:val="18"/>
-          <w:szCs w:val="18"/>
-        </w:rPr>
-        <w:t xml:space="preserve">para </w:t>
-      </w:r>
-      <w:r>
-        <w:rPr>
-          <w:rFonts w:ascii="Arial Black" w:hAnsi="Arial Black"/>
-          <w:sz w:val="18"/>
-          <w:szCs w:val="18"/>
-        </w:rPr>
-        <w:t xml:space="preserve">a entrada do inferno pela Star, e agora tem que encontrar formas de sair de </w:t>
+        <w:t xml:space="preserve">O protagonista foi arremessado para a entrada do inferno pela Star, e agora tem que encontrar formas de sair de </w:t>
       </w:r>
       <w:r>
         <w:rPr>
@@ -266,39 +226,7 @@
           <w:sz w:val="18"/>
           <w:szCs w:val="18"/>
         </w:rPr>
-        <w:t xml:space="preserve">do limbo até </w:t>
-      </w:r>
-      <w:r>
-        <w:rPr>
-          <w:rFonts w:ascii="Arial Black" w:hAnsi="Arial Black"/>
-          <w:sz w:val="18"/>
-          <w:szCs w:val="18"/>
-        </w:rPr>
-        <w:t>a camada “</w:t>
-      </w:r>
-      <w:r>
-        <w:rPr>
-          <w:rFonts w:ascii="Arial Black" w:hAnsi="Arial Black"/>
-          <w:sz w:val="18"/>
-          <w:szCs w:val="18"/>
-        </w:rPr>
-        <w:t xml:space="preserve">traição” para adentrar </w:t>
-      </w:r>
-      <w:r>
-        <w:rPr>
-          <w:rFonts w:ascii="Arial Black" w:hAnsi="Arial Black"/>
-          <w:sz w:val="18"/>
-          <w:szCs w:val="18"/>
-        </w:rPr>
-        <w:t xml:space="preserve">e </w:t>
-      </w:r>
-      <w:r>
-        <w:rPr>
-          <w:rFonts w:ascii="Arial Black" w:hAnsi="Arial Black"/>
-          <w:sz w:val="18"/>
-          <w:szCs w:val="18"/>
-        </w:rPr>
-        <w:t>obter a dignidade de entrar no paraíso jurássico.</w:t>
+        <w:t>do limbo até a camada “traição” para adentrar e obter a dignidade de entrar no paraíso jurássico.</w:t>
         <w:br/>
         <w:br/>
         <w:t xml:space="preserve">Sempre que o protagonista for derrotado, ele é </w:t>
@@ -374,31 +302,7 @@
           <w:sz w:val="18"/>
           <w:szCs w:val="18"/>
         </w:rPr>
-        <w:t xml:space="preserve">Satã é um mendigo </w:t>
-      </w:r>
-      <w:r>
-        <w:rPr>
-          <w:rFonts w:ascii="Arial Black" w:hAnsi="Arial Black"/>
-          <w:sz w:val="18"/>
-          <w:szCs w:val="18"/>
-        </w:rPr>
-        <w:t xml:space="preserve">que transcende o tecido do tempo </w:t>
-      </w:r>
-      <w:r>
-        <w:rPr>
-          <w:rFonts w:ascii="Arial Black" w:hAnsi="Arial Black"/>
-          <w:sz w:val="18"/>
-          <w:szCs w:val="18"/>
-        </w:rPr>
-        <w:t xml:space="preserve">que foi expulso do inferno pelo conglomerado Stairs. </w:t>
-      </w:r>
-      <w:r>
-        <w:rPr>
-          <w:rFonts w:ascii="Arial Black" w:hAnsi="Arial Black"/>
-          <w:sz w:val="18"/>
-          <w:szCs w:val="18"/>
-        </w:rPr>
-        <w:t>Seus lacaios estão subjulgados pelo conglomerados.</w:t>
+        <w:t>Satã é um mendigo que transcende o tecido do tempo que foi expulso do inferno pelo conglomerado Stairs. Seus lacaios estão subjulgados pelo conglomerados.</w:t>
       </w:r>
     </w:p>
     <w:p>
@@ -519,6 +423,7 @@
     <w:p>
       <w:pPr>
         <w:pStyle w:val="Normal"/>
+        <w:spacing w:before="0" w:after="160"/>
         <w:jc w:val="start"/>
         <w:rPr>
           <w:rFonts w:ascii="Arial Black" w:hAnsi="Arial Black"/>
@@ -589,55 +494,7 @@
           <w:sz w:val="18"/>
           <w:szCs w:val="18"/>
         </w:rPr>
-        <w:t xml:space="preserve">Personagem </w:t>
-      </w:r>
-      <w:r>
-        <w:rPr>
-          <w:rFonts w:ascii="Arial Black" w:hAnsi="Arial Black"/>
-          <w:sz w:val="18"/>
-          <w:szCs w:val="18"/>
-        </w:rPr>
-        <w:t xml:space="preserve">começa com uma quantidade de </w:t>
-      </w:r>
-      <w:r>
-        <w:rPr>
-          <w:rFonts w:ascii="Arial Black" w:hAnsi="Arial Black"/>
-          <w:sz w:val="18"/>
-          <w:szCs w:val="18"/>
-        </w:rPr>
-        <w:t xml:space="preserve">vida, podendo </w:t>
-      </w:r>
-      <w:r>
-        <w:rPr>
-          <w:rFonts w:ascii="Arial Black" w:hAnsi="Arial Black"/>
-          <w:sz w:val="18"/>
-          <w:szCs w:val="18"/>
-        </w:rPr>
-        <w:t xml:space="preserve">aumentar </w:t>
-      </w:r>
-      <w:r>
-        <w:rPr>
-          <w:rFonts w:ascii="Arial Black" w:hAnsi="Arial Black"/>
-          <w:sz w:val="18"/>
-          <w:szCs w:val="18"/>
-        </w:rPr>
-        <w:t>com iten</w:t>
-      </w:r>
-      <w:r>
-        <w:rPr>
-          <w:rFonts w:ascii="Arial Black" w:hAnsi="Arial Black"/>
-          <w:sz w:val="18"/>
-          <w:szCs w:val="18"/>
-        </w:rPr>
-        <w:t>s até um máximo constante</w:t>
-      </w:r>
-      <w:r>
-        <w:rPr>
-          <w:rFonts w:ascii="Arial Black" w:hAnsi="Arial Black"/>
-          <w:sz w:val="18"/>
-          <w:szCs w:val="18"/>
-        </w:rPr>
-        <w:t>.</w:t>
+        <w:t>Personagem começa com uma quantidade de vida, podendo aumentar com itens até um máximo constante.</w:t>
       </w:r>
     </w:p>
     <w:p>
@@ -694,50 +551,26 @@
           <w:sz w:val="18"/>
           <w:szCs w:val="18"/>
         </w:rPr>
-        <w:t xml:space="preserve">* mordida = ataque pesado com curto alcance. </w:t>
-      </w:r>
-      <w:r>
-        <w:rPr>
-          <w:rFonts w:ascii="Arial Black" w:hAnsi="Arial Black"/>
-          <w:sz w:val="18"/>
-          <w:szCs w:val="18"/>
-        </w:rPr>
-        <w:t>É possível comer alguns inimigos e objetos com a mordida, que faz regenerar vida.</w:t>
-      </w:r>
-    </w:p>
-    <w:p>
-      <w:pPr>
-        <w:pStyle w:val="Normal"/>
-        <w:jc w:val="start"/>
-        <w:rPr>
-          <w:rFonts w:ascii="Arial Black" w:hAnsi="Arial Black"/>
-          <w:sz w:val="18"/>
-          <w:szCs w:val="18"/>
-        </w:rPr>
-      </w:pPr>
-      <w:r>
-        <w:rPr>
-          <w:rFonts w:ascii="Arial Black" w:hAnsi="Arial Black"/>
-          <w:sz w:val="18"/>
-          <w:szCs w:val="18"/>
-        </w:rPr>
-        <w:t xml:space="preserve">Personagem pode carregar </w:t>
-      </w:r>
-      <w:r>
-        <w:rPr>
-          <w:rFonts w:ascii="Arial Black" w:hAnsi="Arial Black"/>
-          <w:sz w:val="18"/>
-          <w:szCs w:val="18"/>
-        </w:rPr>
-        <w:t>artefatos</w:t>
-      </w:r>
-      <w:r>
-        <w:rPr>
-          <w:rFonts w:ascii="Arial Black" w:hAnsi="Arial Black"/>
-          <w:sz w:val="18"/>
-          <w:szCs w:val="18"/>
-        </w:rPr>
-        <w:t xml:space="preserve"> que adicionam funcionalidades ou aumentam atributos.</w:t>
+        <w:t>* mordida = ataque pesado com curto alcance. É possível comer alguns inimigos e objetos com a mordida, que faz regenerar vida.</w:t>
+      </w:r>
+    </w:p>
+    <w:p>
+      <w:pPr>
+        <w:pStyle w:val="Normal"/>
+        <w:jc w:val="start"/>
+        <w:rPr>
+          <w:rFonts w:ascii="Arial Black" w:hAnsi="Arial Black"/>
+          <w:sz w:val="18"/>
+          <w:szCs w:val="18"/>
+        </w:rPr>
+      </w:pPr>
+      <w:r>
+        <w:rPr>
+          <w:rFonts w:ascii="Arial Black" w:hAnsi="Arial Black"/>
+          <w:sz w:val="18"/>
+          <w:szCs w:val="18"/>
+        </w:rPr>
+        <w:t>Personagem pode carregar artefatos que adicionam funcionalidades ou aumentam atributos.</w:t>
       </w:r>
     </w:p>
     <w:p>
@@ -887,74 +720,26 @@
           <w:sz w:val="18"/>
           <w:szCs w:val="18"/>
         </w:rPr>
-        <w:t xml:space="preserve">infernaiz: </w:t>
-      </w:r>
-      <w:r>
-        <w:rPr>
-          <w:rFonts w:ascii="Arial Black" w:hAnsi="Arial Black"/>
-          <w:sz w:val="18"/>
-          <w:szCs w:val="18"/>
-        </w:rPr>
-        <w:t>C</w:t>
-      </w:r>
-      <w:r>
-        <w:rPr>
-          <w:rFonts w:ascii="Arial Black" w:hAnsi="Arial Black"/>
-          <w:sz w:val="18"/>
-          <w:szCs w:val="18"/>
-        </w:rPr>
-        <w:t xml:space="preserve">ostumeiramente possuem relação maior com as dinâmicas de cada camada. </w:t>
-      </w:r>
-      <w:r>
-        <w:rPr>
-          <w:rFonts w:ascii="Arial Black" w:hAnsi="Arial Black"/>
-          <w:sz w:val="18"/>
-          <w:szCs w:val="18"/>
-        </w:rPr>
-        <w:t xml:space="preserve">Tipos = </w:t>
-      </w:r>
-      <w:r>
-        <w:rPr>
-          <w:rFonts w:ascii="Arial Black" w:hAnsi="Arial Black"/>
-          <w:sz w:val="18"/>
-          <w:szCs w:val="18"/>
-        </w:rPr>
-        <w:t>diabretes, esqueletos, pecadores.</w:t>
-      </w:r>
-    </w:p>
-    <w:p>
-      <w:pPr>
-        <w:pStyle w:val="Normal"/>
-        <w:jc w:val="start"/>
-        <w:rPr>
-          <w:rFonts w:ascii="Arial Black" w:hAnsi="Arial Black"/>
-          <w:sz w:val="18"/>
-          <w:szCs w:val="18"/>
-        </w:rPr>
-      </w:pPr>
-      <w:r>
-        <w:rPr>
-          <w:rFonts w:ascii="Arial Black" w:hAnsi="Arial Black"/>
-          <w:sz w:val="18"/>
-          <w:szCs w:val="18"/>
-        </w:rPr>
-        <w:t xml:space="preserve">escadas: </w:t>
-      </w:r>
-      <w:r>
-        <w:rPr>
-          <w:rFonts w:ascii="Arial Black" w:hAnsi="Arial Black"/>
-          <w:sz w:val="18"/>
-          <w:szCs w:val="18"/>
-        </w:rPr>
-        <w:t xml:space="preserve">podem spawnar alguns infernaiz. Tipos = </w:t>
-      </w:r>
-      <w:r>
-        <w:rPr>
-          <w:rFonts w:ascii="Arial Black" w:hAnsi="Arial Black"/>
-          <w:sz w:val="18"/>
-          <w:szCs w:val="18"/>
-        </w:rPr>
-        <w:t>de mão, degraus, giratória.</w:t>
+        <w:t>infernaiz: Costumeiramente possuem relação maior com as dinâmicas de cada camada. Tipos = diabretes, esqueletos, pecadores.</w:t>
+      </w:r>
+    </w:p>
+    <w:p>
+      <w:pPr>
+        <w:pStyle w:val="Normal"/>
+        <w:jc w:val="start"/>
+        <w:rPr>
+          <w:rFonts w:ascii="Arial Black" w:hAnsi="Arial Black"/>
+          <w:sz w:val="18"/>
+          <w:szCs w:val="18"/>
+        </w:rPr>
+      </w:pPr>
+      <w:r>
+        <w:rPr>
+          <w:rFonts w:ascii="Arial Black" w:hAnsi="Arial Black"/>
+          <w:sz w:val="18"/>
+          <w:szCs w:val="18"/>
+        </w:rPr>
+        <w:t>escadas: podem spawnar alguns infernaiz. Tipos = de mão, degraus, giratória.</w:t>
       </w:r>
     </w:p>
     <w:p>
@@ -1029,66 +814,26 @@
           <w:sz w:val="18"/>
           <w:szCs w:val="18"/>
         </w:rPr>
-        <w:t xml:space="preserve">Grupo de cenários, que têm tipos de inimigos em comum, </w:t>
-      </w:r>
-      <w:r>
-        <w:rPr>
-          <w:rFonts w:ascii="Arial Black" w:hAnsi="Arial Black"/>
-          <w:sz w:val="18"/>
-          <w:szCs w:val="18"/>
-        </w:rPr>
-        <w:t>conjunto de atributos,</w:t>
-      </w:r>
-      <w:r>
-        <w:rPr>
-          <w:rFonts w:ascii="Arial Black" w:hAnsi="Arial Black"/>
-          <w:sz w:val="18"/>
-          <w:szCs w:val="18"/>
-        </w:rPr>
-        <w:t xml:space="preserve"> cores próprias e um chefã</w:t>
-      </w:r>
-      <w:r>
-        <w:rPr>
-          <w:rFonts w:ascii="Arial Black" w:hAnsi="Arial Black"/>
-          <w:sz w:val="18"/>
-          <w:szCs w:val="18"/>
-        </w:rPr>
-        <w:t>o</w:t>
-      </w:r>
-      <w:r>
-        <w:rPr>
-          <w:rFonts w:ascii="Arial Black" w:hAnsi="Arial Black"/>
-          <w:sz w:val="18"/>
-          <w:szCs w:val="18"/>
-        </w:rPr>
-        <w:t xml:space="preserve"> no final.</w:t>
-      </w:r>
-    </w:p>
-    <w:p>
-      <w:pPr>
-        <w:pStyle w:val="Normal"/>
-        <w:jc w:val="start"/>
-        <w:rPr>
-          <w:rFonts w:ascii="Arial Black" w:hAnsi="Arial Black"/>
-          <w:sz w:val="18"/>
-          <w:szCs w:val="18"/>
-        </w:rPr>
-      </w:pPr>
-      <w:r>
-        <w:rPr>
-          <w:rFonts w:ascii="Arial Black" w:hAnsi="Arial Black"/>
-          <w:sz w:val="18"/>
-          <w:szCs w:val="18"/>
-        </w:rPr>
-        <w:t xml:space="preserve">Cada camada tem uma dinâmica única, </w:t>
-      </w:r>
-      <w:r>
-        <w:rPr>
-          <w:rFonts w:ascii="Arial Black" w:hAnsi="Arial Black"/>
-          <w:sz w:val="18"/>
-          <w:szCs w:val="18"/>
-        </w:rPr>
-        <w:t>como efeitos no cenário ou inimigos.</w:t>
+        <w:t>Grupo de cenários, que têm tipos de inimigos em comum, conjunto de atributos, cores próprias e um chefão no final.</w:t>
+      </w:r>
+    </w:p>
+    <w:p>
+      <w:pPr>
+        <w:pStyle w:val="Normal"/>
+        <w:jc w:val="start"/>
+        <w:rPr>
+          <w:rFonts w:ascii="Arial Black" w:hAnsi="Arial Black"/>
+          <w:sz w:val="18"/>
+          <w:szCs w:val="18"/>
+        </w:rPr>
+      </w:pPr>
+      <w:r>
+        <w:rPr>
+          <w:rFonts w:ascii="Arial Black" w:hAnsi="Arial Black"/>
+          <w:sz w:val="18"/>
+          <w:szCs w:val="18"/>
+        </w:rPr>
+        <w:t>Cada camada tem uma dinâmica única, como efeitos no cenário ou inimigos.</w:t>
       </w:r>
     </w:p>
     <w:p>
@@ -1144,6 +889,680 @@
           <w:sz w:val="18"/>
           <w:szCs w:val="18"/>
         </w:rPr>
+      </w:r>
+    </w:p>
+    <w:p>
+      <w:pPr>
+        <w:pStyle w:val="Normal"/>
+        <w:jc w:val="start"/>
+        <w:rPr>
+          <w:rFonts w:ascii="Arial Black" w:hAnsi="Arial Black"/>
+          <w:sz w:val="18"/>
+          <w:szCs w:val="18"/>
+        </w:rPr>
+      </w:pPr>
+      <w:r>
+        <w:rPr>
+          <w:rFonts w:ascii="Arial Black" w:hAnsi="Arial Black"/>
+          <w:sz w:val="18"/>
+          <w:szCs w:val="18"/>
+        </w:rPr>
+      </w:r>
+    </w:p>
+    <w:p>
+      <w:pPr>
+        <w:pStyle w:val="Normal"/>
+        <w:jc w:val="start"/>
+        <w:rPr>
+          <w:rFonts w:ascii="Arial Black" w:hAnsi="Arial Black"/>
+          <w:sz w:val="18"/>
+          <w:szCs w:val="18"/>
+        </w:rPr>
+      </w:pPr>
+      <w:r>
+        <w:rPr>
+          <w:rFonts w:ascii="Arial Black" w:hAnsi="Arial Black"/>
+          <w:sz w:val="18"/>
+          <w:szCs w:val="18"/>
+        </w:rPr>
+        <w:t>ITENS:</w:t>
+      </w:r>
+    </w:p>
+    <w:p>
+      <w:pPr>
+        <w:pStyle w:val="Normal"/>
+        <w:jc w:val="start"/>
+        <w:rPr>
+          <w:rFonts w:ascii="Arial Black" w:hAnsi="Arial Black"/>
+          <w:sz w:val="18"/>
+          <w:szCs w:val="18"/>
+        </w:rPr>
+      </w:pPr>
+      <w:r>
+        <w:rPr>
+          <w:rFonts w:ascii="Arial Black" w:hAnsi="Arial Black"/>
+          <w:sz w:val="18"/>
+          <w:szCs w:val="18"/>
+        </w:rPr>
+        <w:t>I</w:t>
+      </w:r>
+      <w:r>
+        <w:rPr>
+          <w:rFonts w:ascii="Arial Black" w:hAnsi="Arial Black"/>
+          <w:sz w:val="18"/>
+          <w:szCs w:val="18"/>
+        </w:rPr>
+        <w:t xml:space="preserve">tens de efeito: </w:t>
+      </w:r>
+      <w:r>
+        <w:rPr>
+          <w:rFonts w:ascii="Arial Black" w:hAnsi="Arial Black"/>
+          <w:sz w:val="18"/>
+          <w:szCs w:val="18"/>
+        </w:rPr>
+        <w:t>podem ser usados ao longo da partida para dar vantagens</w:t>
+      </w:r>
+    </w:p>
+    <w:p>
+      <w:pPr>
+        <w:pStyle w:val="Normal"/>
+        <w:widowControl/>
+        <w:suppressAutoHyphens w:val="true"/>
+        <w:bidi w:val="0"/>
+        <w:spacing w:lineRule="auto" w:line="278" w:before="0" w:after="160"/>
+        <w:ind w:hanging="567" w:start="567" w:end="0"/>
+        <w:jc w:val="start"/>
+        <w:rPr>
+          <w:rFonts w:ascii="Arial Black" w:hAnsi="Arial Black"/>
+          <w:sz w:val="18"/>
+          <w:szCs w:val="18"/>
+        </w:rPr>
+      </w:pPr>
+      <w:r>
+        <w:rPr>
+          <w:rFonts w:ascii="Arial Black" w:hAnsi="Arial Black"/>
+          <w:sz w:val="18"/>
+          <w:szCs w:val="18"/>
+        </w:rPr>
+        <w:t xml:space="preserve">* pimenta: item básico que ao ser consumido dá efeito de fogo no ataque por </w:t>
+      </w:r>
+      <w:r>
+        <w:rPr>
+          <w:rFonts w:ascii="Arial Black" w:hAnsi="Arial Black"/>
+          <w:sz w:val="18"/>
+          <w:szCs w:val="18"/>
+          <w:u w:val="single"/>
+        </w:rPr>
+        <w:t>um tempo</w:t>
+      </w:r>
+      <w:r>
+        <w:rPr>
+          <w:rFonts w:ascii="Arial Black" w:hAnsi="Arial Black"/>
+          <w:sz w:val="18"/>
+          <w:szCs w:val="18"/>
+        </w:rPr>
+        <w:t xml:space="preserve">. Inimigos atacados com efeito de fogo ficam pegando fogo por um tempo, tirando vida ao longo de </w:t>
+      </w:r>
+      <w:r>
+        <w:rPr>
+          <w:rFonts w:ascii="Arial Black" w:hAnsi="Arial Black"/>
+          <w:sz w:val="18"/>
+          <w:szCs w:val="18"/>
+          <w:u w:val="single"/>
+        </w:rPr>
+        <w:t xml:space="preserve">5 </w:t>
+      </w:r>
+      <w:r>
+        <w:rPr>
+          <w:rFonts w:ascii="Arial Black" w:hAnsi="Arial Black"/>
+          <w:sz w:val="18"/>
+          <w:szCs w:val="18"/>
+        </w:rPr>
+        <w:t xml:space="preserve">segundos. </w:t>
+      </w:r>
+    </w:p>
+    <w:p>
+      <w:pPr>
+        <w:pStyle w:val="Normal"/>
+        <w:widowControl/>
+        <w:suppressAutoHyphens w:val="true"/>
+        <w:bidi w:val="0"/>
+        <w:spacing w:lineRule="auto" w:line="278" w:before="0" w:after="160"/>
+        <w:ind w:hanging="567" w:start="567" w:end="0"/>
+        <w:jc w:val="start"/>
+        <w:rPr>
+          <w:rFonts w:ascii="Arial Black" w:hAnsi="Arial Black"/>
+          <w:sz w:val="18"/>
+          <w:szCs w:val="18"/>
+        </w:rPr>
+      </w:pPr>
+      <w:r>
+        <w:rPr>
+          <w:rFonts w:ascii="Arial Black" w:hAnsi="Arial Black"/>
+          <w:sz w:val="18"/>
+          <w:szCs w:val="18"/>
+        </w:rPr>
+        <w:t xml:space="preserve">* carne apimentada: item que, ao ser consumido, regenera </w:t>
+      </w:r>
+      <w:r>
+        <w:rPr>
+          <w:rFonts w:ascii="Arial Black" w:hAnsi="Arial Black"/>
+          <w:sz w:val="18"/>
+          <w:szCs w:val="18"/>
+          <w:u w:val="single"/>
+        </w:rPr>
+        <w:t>um pouco</w:t>
+      </w:r>
+      <w:r>
+        <w:rPr>
+          <w:rFonts w:ascii="Arial Black" w:hAnsi="Arial Black"/>
+          <w:sz w:val="18"/>
+          <w:szCs w:val="18"/>
+        </w:rPr>
+        <w:t xml:space="preserve"> de vida e dá efeito menor de fogo no ataque por </w:t>
+      </w:r>
+      <w:r>
+        <w:rPr>
+          <w:rFonts w:ascii="Arial Black" w:hAnsi="Arial Black"/>
+          <w:sz w:val="18"/>
+          <w:szCs w:val="18"/>
+          <w:u w:val="single"/>
+        </w:rPr>
+        <w:t>um pouco</w:t>
+      </w:r>
+      <w:r>
+        <w:rPr>
+          <w:rFonts w:ascii="Arial Black" w:hAnsi="Arial Black"/>
+          <w:sz w:val="18"/>
+          <w:szCs w:val="18"/>
+        </w:rPr>
+        <w:t xml:space="preserve"> de tempo, pegando fogo por</w:t>
+      </w:r>
+      <w:r>
+        <w:rPr>
+          <w:rFonts w:ascii="Arial Black" w:hAnsi="Arial Black"/>
+          <w:sz w:val="18"/>
+          <w:szCs w:val="18"/>
+          <w:u w:val="single"/>
+        </w:rPr>
+        <w:t xml:space="preserve"> 3 </w:t>
+      </w:r>
+      <w:r>
+        <w:rPr>
+          <w:rFonts w:ascii="Arial Black" w:hAnsi="Arial Black"/>
+          <w:sz w:val="18"/>
+          <w:szCs w:val="18"/>
+        </w:rPr>
+        <w:t>segundos ao ser atacado.</w:t>
+      </w:r>
+    </w:p>
+    <w:p>
+      <w:pPr>
+        <w:pStyle w:val="Normal"/>
+        <w:widowControl/>
+        <w:suppressAutoHyphens w:val="true"/>
+        <w:bidi w:val="0"/>
+        <w:spacing w:lineRule="auto" w:line="278" w:before="0" w:after="160"/>
+        <w:ind w:hanging="567" w:start="567" w:end="0"/>
+        <w:jc w:val="start"/>
+        <w:rPr>
+          <w:rFonts w:ascii="Arial Black" w:hAnsi="Arial Black"/>
+          <w:sz w:val="18"/>
+          <w:szCs w:val="18"/>
+        </w:rPr>
+      </w:pPr>
+      <w:r>
+        <w:rPr>
+          <w:rFonts w:ascii="Arial Black" w:hAnsi="Arial Black"/>
+          <w:sz w:val="18"/>
+          <w:szCs w:val="18"/>
+        </w:rPr>
+        <w:t xml:space="preserve">* cuscuz paulista: tira um pouco da vida quando usado e dá efeito de intoxicado no inimigo. Inimigo </w:t>
+      </w:r>
+      <w:r>
+        <w:rPr>
+          <w:rFonts w:ascii="Arial Black" w:hAnsi="Arial Black"/>
+          <w:sz w:val="18"/>
+          <w:szCs w:val="18"/>
+        </w:rPr>
+        <w:t>intoxicado tem os status de ataque e velocidade diminuidos.</w:t>
+      </w:r>
+    </w:p>
+    <w:p>
+      <w:pPr>
+        <w:pStyle w:val="Normal"/>
+        <w:widowControl/>
+        <w:suppressAutoHyphens w:val="true"/>
+        <w:bidi w:val="0"/>
+        <w:spacing w:lineRule="auto" w:line="278" w:before="0" w:after="160"/>
+        <w:ind w:hanging="567" w:start="567" w:end="0"/>
+        <w:jc w:val="start"/>
+        <w:rPr>
+          <w:rFonts w:ascii="Arial Black" w:hAnsi="Arial Black"/>
+          <w:sz w:val="18"/>
+          <w:szCs w:val="18"/>
+        </w:rPr>
+      </w:pPr>
+      <w:r>
+        <w:rPr>
+          <w:rFonts w:ascii="Arial Black" w:hAnsi="Arial Black"/>
+          <w:sz w:val="18"/>
+          <w:szCs w:val="18"/>
+        </w:rPr>
+        <w:t>* coração: aumenta a regeneração de vida por um breve momento até a vida ficar máxima ou o tempo acabar.</w:t>
+      </w:r>
+    </w:p>
+    <w:p>
+      <w:pPr>
+        <w:pStyle w:val="Normal"/>
+        <w:widowControl/>
+        <w:suppressAutoHyphens w:val="true"/>
+        <w:bidi w:val="0"/>
+        <w:spacing w:lineRule="auto" w:line="278" w:before="0" w:after="160"/>
+        <w:ind w:hanging="567" w:start="567" w:end="0"/>
+        <w:jc w:val="start"/>
+        <w:rPr>
+          <w:rFonts w:ascii="Arial Black" w:hAnsi="Arial Black"/>
+          <w:sz w:val="18"/>
+          <w:szCs w:val="18"/>
+        </w:rPr>
+      </w:pPr>
+      <w:r>
+        <w:rPr>
+          <w:rFonts w:ascii="Arial Black" w:hAnsi="Arial Black"/>
+          <w:sz w:val="18"/>
+          <w:szCs w:val="18"/>
+        </w:rPr>
+        <w:t xml:space="preserve">* bomba: arremessar </w:t>
+      </w:r>
+      <w:r>
+        <w:rPr>
+          <w:rFonts w:ascii="Arial Black" w:hAnsi="Arial Black"/>
+          <w:sz w:val="18"/>
+          <w:szCs w:val="18"/>
+        </w:rPr>
+        <w:t xml:space="preserve">no chão e depois de </w:t>
+      </w:r>
+      <w:r>
+        <w:rPr>
+          <w:rFonts w:ascii="Arial Black" w:hAnsi="Arial Black"/>
+          <w:sz w:val="18"/>
+          <w:szCs w:val="18"/>
+          <w:u w:val="single"/>
+        </w:rPr>
+        <w:t>grande</w:t>
+      </w:r>
+      <w:r>
+        <w:rPr>
+          <w:rFonts w:ascii="Arial Black" w:hAnsi="Arial Black"/>
+          <w:sz w:val="18"/>
+          <w:szCs w:val="18"/>
+        </w:rPr>
+        <w:t xml:space="preserve"> tempo</w:t>
+      </w:r>
+      <w:r>
+        <w:rPr>
+          <w:rFonts w:ascii="Arial Black" w:hAnsi="Arial Black"/>
+          <w:sz w:val="18"/>
+          <w:szCs w:val="18"/>
+        </w:rPr>
+        <w:t xml:space="preserve"> causar dano </w:t>
+      </w:r>
+      <w:r>
+        <w:rPr>
+          <w:rFonts w:ascii="Arial Black" w:hAnsi="Arial Black"/>
+          <w:sz w:val="18"/>
+          <w:szCs w:val="18"/>
+          <w:u w:val="single"/>
+        </w:rPr>
+        <w:t>grande</w:t>
+      </w:r>
+      <w:r>
+        <w:rPr>
+          <w:rFonts w:ascii="Arial Black" w:hAnsi="Arial Black"/>
+          <w:sz w:val="18"/>
+          <w:szCs w:val="18"/>
+        </w:rPr>
+        <w:t xml:space="preserve"> em </w:t>
+      </w:r>
+      <w:r>
+        <w:rPr>
+          <w:rFonts w:ascii="Arial Black" w:hAnsi="Arial Black"/>
+          <w:sz w:val="18"/>
+          <w:szCs w:val="18"/>
+          <w:u w:val="single"/>
+        </w:rPr>
+        <w:t>grande</w:t>
+      </w:r>
+      <w:r>
+        <w:rPr>
+          <w:rFonts w:ascii="Arial Black" w:hAnsi="Arial Black"/>
+          <w:sz w:val="18"/>
+          <w:szCs w:val="18"/>
+        </w:rPr>
+        <w:t xml:space="preserve"> </w:t>
+      </w:r>
+      <w:r>
+        <w:rPr>
+          <w:rFonts w:ascii="Arial Black" w:hAnsi="Arial Black"/>
+          <w:sz w:val="18"/>
+          <w:szCs w:val="18"/>
+        </w:rPr>
+        <w:t>área</w:t>
+      </w:r>
+    </w:p>
+    <w:p>
+      <w:pPr>
+        <w:pStyle w:val="Normal"/>
+        <w:widowControl/>
+        <w:suppressAutoHyphens w:val="true"/>
+        <w:bidi w:val="0"/>
+        <w:spacing w:lineRule="auto" w:line="278" w:before="0" w:after="160"/>
+        <w:ind w:hanging="567" w:start="567" w:end="0"/>
+        <w:jc w:val="start"/>
+        <w:rPr>
+          <w:rFonts w:ascii="Arial Black" w:hAnsi="Arial Black"/>
+          <w:sz w:val="18"/>
+          <w:szCs w:val="18"/>
+        </w:rPr>
+      </w:pPr>
+      <w:r>
+        <w:rPr>
+          <w:rFonts w:ascii="Arial Black" w:hAnsi="Arial Black"/>
+          <w:sz w:val="18"/>
+          <w:szCs w:val="18"/>
+        </w:rPr>
+        <w:t xml:space="preserve">* dinamite: </w:t>
+      </w:r>
+      <w:r>
+        <w:rPr>
+          <w:rFonts w:ascii="Arial Black" w:hAnsi="Arial Black"/>
+          <w:sz w:val="18"/>
+          <w:szCs w:val="18"/>
+        </w:rPr>
+        <w:t xml:space="preserve">arremessar no chão e depois de </w:t>
+      </w:r>
+      <w:r>
+        <w:rPr>
+          <w:rFonts w:ascii="Arial Black" w:hAnsi="Arial Black"/>
+          <w:sz w:val="18"/>
+          <w:szCs w:val="18"/>
+          <w:u w:val="single"/>
+        </w:rPr>
+        <w:t>pouco</w:t>
+      </w:r>
+      <w:r>
+        <w:rPr>
+          <w:rFonts w:ascii="Arial Black" w:hAnsi="Arial Black"/>
+          <w:b w:val="false"/>
+          <w:bCs w:val="false"/>
+          <w:sz w:val="18"/>
+          <w:szCs w:val="18"/>
+          <w:u w:val="none"/>
+        </w:rPr>
+        <w:t xml:space="preserve"> tempo causar pouco dano em uma </w:t>
+      </w:r>
+      <w:r>
+        <w:rPr>
+          <w:rFonts w:ascii="Arial Black" w:hAnsi="Arial Black"/>
+          <w:b w:val="false"/>
+          <w:bCs w:val="false"/>
+          <w:sz w:val="18"/>
+          <w:szCs w:val="18"/>
+          <w:u w:val="single"/>
+        </w:rPr>
+        <w:t>pequena</w:t>
+      </w:r>
+      <w:r>
+        <w:rPr>
+          <w:rFonts w:ascii="Arial Black" w:hAnsi="Arial Black"/>
+          <w:b w:val="false"/>
+          <w:bCs w:val="false"/>
+          <w:sz w:val="18"/>
+          <w:szCs w:val="18"/>
+          <w:u w:val="none"/>
+        </w:rPr>
+        <w:t xml:space="preserve"> área.</w:t>
+      </w:r>
+    </w:p>
+    <w:p>
+      <w:pPr>
+        <w:pStyle w:val="Normal"/>
+        <w:widowControl/>
+        <w:suppressAutoHyphens w:val="true"/>
+        <w:bidi w:val="0"/>
+        <w:spacing w:lineRule="auto" w:line="278" w:before="0" w:after="160"/>
+        <w:ind w:hanging="567" w:start="567" w:end="0"/>
+        <w:jc w:val="start"/>
+        <w:rPr>
+          <w:rFonts w:ascii="Arial Black" w:hAnsi="Arial Black"/>
+          <w:sz w:val="18"/>
+          <w:szCs w:val="18"/>
+        </w:rPr>
+      </w:pPr>
+      <w:r>
+        <w:rPr>
+          <w:rFonts w:ascii="Arial Black" w:hAnsi="Arial Black"/>
+          <w:sz w:val="18"/>
+          <w:szCs w:val="18"/>
+        </w:rPr>
+        <w:t xml:space="preserve">Artefatos: </w:t>
+      </w:r>
+      <w:r>
+        <w:rPr>
+          <w:rFonts w:ascii="Arial Black" w:hAnsi="Arial Black"/>
+          <w:sz w:val="18"/>
+          <w:szCs w:val="18"/>
+        </w:rPr>
+        <w:t>podem ser coletados para dar melhorias ao Blitz</w:t>
+      </w:r>
+    </w:p>
+    <w:p>
+      <w:pPr>
+        <w:pStyle w:val="Normal"/>
+        <w:widowControl/>
+        <w:suppressAutoHyphens w:val="true"/>
+        <w:bidi w:val="0"/>
+        <w:spacing w:lineRule="auto" w:line="278" w:before="0" w:after="160"/>
+        <w:ind w:hanging="567" w:start="567" w:end="0"/>
+        <w:jc w:val="start"/>
+        <w:rPr>
+          <w:rFonts w:ascii="Arial Black" w:hAnsi="Arial Black"/>
+          <w:sz w:val="18"/>
+          <w:szCs w:val="18"/>
+        </w:rPr>
+      </w:pPr>
+      <w:r>
+        <w:rPr>
+          <w:rFonts w:ascii="Arial Black" w:hAnsi="Arial Black"/>
+          <w:sz w:val="18"/>
+          <w:szCs w:val="18"/>
+        </w:rPr>
+        <w:t>* lichador: aumenta o dano da garra</w:t>
+      </w:r>
+    </w:p>
+    <w:p>
+      <w:pPr>
+        <w:pStyle w:val="Normal"/>
+        <w:widowControl/>
+        <w:suppressAutoHyphens w:val="true"/>
+        <w:bidi w:val="0"/>
+        <w:spacing w:lineRule="auto" w:line="278" w:before="0" w:after="160"/>
+        <w:ind w:hanging="567" w:start="567" w:end="0"/>
+        <w:jc w:val="start"/>
+        <w:rPr>
+          <w:rFonts w:ascii="Arial Black" w:hAnsi="Arial Black"/>
+          <w:sz w:val="18"/>
+          <w:szCs w:val="18"/>
+        </w:rPr>
+      </w:pPr>
+      <w:r>
+        <w:rPr>
+          <w:rFonts w:ascii="Arial Black" w:hAnsi="Arial Black"/>
+          <w:sz w:val="18"/>
+          <w:szCs w:val="18"/>
+        </w:rPr>
+        <w:t>* kit médico: aumenta um pouco a vida máxima, até seu limite.</w:t>
+      </w:r>
+    </w:p>
+    <w:p>
+      <w:pPr>
+        <w:pStyle w:val="Normal"/>
+        <w:widowControl/>
+        <w:suppressAutoHyphens w:val="true"/>
+        <w:bidi w:val="0"/>
+        <w:spacing w:lineRule="auto" w:line="278" w:before="0" w:after="160"/>
+        <w:ind w:hanging="567" w:start="567" w:end="0"/>
+        <w:jc w:val="start"/>
+        <w:rPr>
+          <w:rFonts w:ascii="Arial Black" w:hAnsi="Arial Black"/>
+          <w:sz w:val="18"/>
+          <w:szCs w:val="18"/>
+        </w:rPr>
+      </w:pPr>
+      <w:r>
+        <w:rPr>
+          <w:rFonts w:ascii="Arial Black" w:hAnsi="Arial Black"/>
+          <w:sz w:val="18"/>
+          <w:szCs w:val="18"/>
+        </w:rPr>
+        <w:t>* isqueiro: aumenta dano da bomba e dinamite.</w:t>
+      </w:r>
+    </w:p>
+    <w:p>
+      <w:pPr>
+        <w:pStyle w:val="Normal"/>
+        <w:widowControl/>
+        <w:suppressAutoHyphens w:val="true"/>
+        <w:bidi w:val="0"/>
+        <w:spacing w:lineRule="auto" w:line="278" w:before="0" w:after="160"/>
+        <w:ind w:hanging="567" w:start="567" w:end="0"/>
+        <w:jc w:val="start"/>
+        <w:rPr>
+          <w:rFonts w:ascii="Arial Black" w:hAnsi="Arial Black"/>
+          <w:sz w:val="18"/>
+          <w:szCs w:val="18"/>
+        </w:rPr>
+      </w:pPr>
+      <w:r>
+        <w:rPr>
+          <w:rFonts w:ascii="Arial Black" w:hAnsi="Arial Black"/>
+          <w:sz w:val="18"/>
+          <w:szCs w:val="18"/>
+        </w:rPr>
+        <w:t>* dentadura: aumenta o dano da mordida e dá a chance de aterrorizado. Inimigos assustados fogem do blitz por um momento.</w:t>
+      </w:r>
+    </w:p>
+    <w:p>
+      <w:pPr>
+        <w:pStyle w:val="Normal"/>
+        <w:widowControl/>
+        <w:suppressAutoHyphens w:val="true"/>
+        <w:bidi w:val="0"/>
+        <w:spacing w:lineRule="auto" w:line="278" w:before="0" w:after="160"/>
+        <w:ind w:hanging="567" w:start="567" w:end="0"/>
+        <w:jc w:val="start"/>
+        <w:rPr>
+          <w:rFonts w:ascii="Arial Black" w:hAnsi="Arial Black"/>
+          <w:sz w:val="18"/>
+          <w:szCs w:val="18"/>
+        </w:rPr>
+      </w:pPr>
+      <w:r>
+        <w:rPr>
+          <w:rFonts w:ascii="Arial Black" w:hAnsi="Arial Black"/>
+          <w:sz w:val="18"/>
+          <w:szCs w:val="18"/>
+        </w:rPr>
+        <w:t>INIMIGOS</w:t>
+      </w:r>
+    </w:p>
+    <w:p>
+      <w:pPr>
+        <w:pStyle w:val="Normal"/>
+        <w:widowControl/>
+        <w:suppressAutoHyphens w:val="true"/>
+        <w:bidi w:val="0"/>
+        <w:spacing w:lineRule="auto" w:line="278" w:before="0" w:after="160"/>
+        <w:ind w:hanging="0" w:start="0" w:end="0"/>
+        <w:jc w:val="start"/>
+        <w:rPr>
+          <w:rFonts w:ascii="Arial Black" w:hAnsi="Arial Black"/>
+          <w:sz w:val="18"/>
+          <w:szCs w:val="18"/>
+        </w:rPr>
+      </w:pPr>
+      <w:r>
+        <w:rPr>
+          <w:rFonts w:ascii="Arial Black" w:hAnsi="Arial Black"/>
+          <w:sz w:val="18"/>
+          <w:szCs w:val="18"/>
+        </w:rPr>
+        <w:t>Diabrete: Inimigo padrão</w:t>
+      </w:r>
+    </w:p>
+    <w:p>
+      <w:pPr>
+        <w:pStyle w:val="Normal"/>
+        <w:widowControl/>
+        <w:suppressAutoHyphens w:val="true"/>
+        <w:bidi w:val="0"/>
+        <w:spacing w:lineRule="auto" w:line="278" w:before="0" w:after="160"/>
+        <w:ind w:hanging="0" w:start="0" w:end="0"/>
+        <w:jc w:val="start"/>
+        <w:rPr>
+          <w:rFonts w:ascii="Arial Black" w:hAnsi="Arial Black"/>
+          <w:sz w:val="18"/>
+          <w:szCs w:val="18"/>
+        </w:rPr>
+      </w:pPr>
+      <w:r>
+        <w:rPr>
+          <w:rFonts w:ascii="Arial Black" w:hAnsi="Arial Black"/>
+          <w:sz w:val="18"/>
+          <w:szCs w:val="18"/>
+        </w:rPr>
+        <w:t>Persegue o blitz, ataca quando perto, pouco hp.</w:t>
+        <w:br/>
+        <w:br/>
+        <w:t xml:space="preserve">Esqueleto: Infernal de longa distância </w:t>
+        <w:br/>
+        <w:t>Arremessa seus ossos no blitz, pode ser atacado e quebrar o projétil.</w:t>
+        <w:br/>
+        <w:t>Tem ossos limitados e os recoleta para recuperar.</w:t>
+        <w:br/>
+        <w:br/>
+        <w:t xml:space="preserve">Escada de Mão(Madeira): Escada padrão </w:t>
+        <w:br/>
+        <w:t>Inimigo mais resistente com menos mobilidade, cai blitz para atacar, longo alcance, quando cai fica vulnerável, Inimigo mais comum.</w:t>
+        <w:br/>
+        <w:br/>
+        <w:t>Escada giratória(Madeira): Escada de agarre</w:t>
+        <w:br/>
+        <w:t>Inimigo bem frágil que fica pulando, quando pula em cima de blitz, fica girando em volta dele o deixando confuso e dando dano.</w:t>
+        <w:br/>
+        <w:br/>
+        <w:t>Escada de degrau(Madeira): Escada defensiva</w:t>
+        <w:br/>
+        <w:t>Inimigo bem resistente, não se move, quando blitz e um inimigo chega, ele impede blitz de chegar no Inimigo.</w:t>
+      </w:r>
+    </w:p>
+    <w:p>
+      <w:pPr>
+        <w:pStyle w:val="Normal"/>
+        <w:jc w:val="start"/>
+        <w:rPr>
+          <w:rFonts w:ascii="Arial Black" w:hAnsi="Arial Black"/>
+          <w:sz w:val="18"/>
+          <w:szCs w:val="18"/>
+        </w:rPr>
+      </w:pPr>
+      <w:r>
+        <w:rPr>
+          <w:rFonts w:ascii="Arial Black" w:hAnsi="Arial Black"/>
+          <w:sz w:val="18"/>
+          <w:szCs w:val="18"/>
+        </w:rPr>
         <w:t>CONTROLES</w:t>
       </w:r>
     </w:p>
@@ -1188,24 +1607,6 @@
     <w:p>
       <w:pPr>
         <w:pStyle w:val="Normal"/>
-        <w:jc w:val="start"/>
-        <w:rPr>
-          <w:rFonts w:ascii="Arial Black" w:hAnsi="Arial Black"/>
-          <w:sz w:val="18"/>
-          <w:szCs w:val="18"/>
-        </w:rPr>
-      </w:pPr>
-      <w:r>
-        <w:rPr>
-          <w:rFonts w:ascii="Arial Black" w:hAnsi="Arial Black"/>
-          <w:sz w:val="18"/>
-          <w:szCs w:val="18"/>
-        </w:rPr>
-      </w:r>
-    </w:p>
-    <w:p>
-      <w:pPr>
-        <w:pStyle w:val="Normal"/>
         <w:spacing w:before="0" w:after="160"/>
         <w:jc w:val="start"/>
         <w:rPr>
@@ -1215,12 +1616,7 @@
         </w:rPr>
       </w:pPr>
       <w:r>
-        <w:rPr>
-          <w:rFonts w:ascii="Arial Black" w:hAnsi="Arial Black"/>
-          <w:sz w:val="18"/>
-          <w:szCs w:val="18"/>
-        </w:rPr>
-        <w:t>ENCAMINHAMENTOS:</w:t>
+        <w:rPr/>
       </w:r>
     </w:p>
     <w:sectPr>
@@ -1638,6 +2034,7 @@
     <w:qFormat/>
     <w:pPr>
       <w:widowControl/>
+      <w:suppressAutoHyphens w:val="true"/>
       <w:bidi w:val="0"/>
       <w:spacing w:lineRule="auto" w:line="278" w:before="0" w:after="160"/>
       <w:jc w:val="start"/>
@@ -2107,6 +2504,32 @@
   </w:style>
   <w:style w:type="paragraph" w:styleId="ndice">
     <w:name w:val="Índice"/>
+    <w:basedOn w:val="Normal"/>
+    <w:qFormat/>
+    <w:pPr>
+      <w:suppressLineNumbers/>
+    </w:pPr>
+    <w:rPr>
+      <w:rFonts w:cs="Arial"/>
+    </w:rPr>
+  </w:style>
+  <w:style w:type="paragraph" w:styleId="Ttulouser">
+    <w:name w:val="Título (user)"/>
+    <w:basedOn w:val="Normal"/>
+    <w:next w:val="BodyText"/>
+    <w:qFormat/>
+    <w:pPr>
+      <w:keepNext w:val="true"/>
+      <w:spacing w:before="240" w:after="120"/>
+    </w:pPr>
+    <w:rPr>
+      <w:rFonts w:ascii="Liberation Sans" w:hAnsi="Liberation Sans" w:eastAsia="Microsoft YaHei" w:cs="Arial"/>
+      <w:sz w:val="28"/>
+      <w:szCs w:val="28"/>
+    </w:rPr>
+  </w:style>
+  <w:style w:type="paragraph" w:styleId="ndiceuser">
+    <w:name w:val="Índice (user)"/>
     <w:basedOn w:val="Normal"/>
     <w:qFormat/>
     <w:pPr>
@@ -2207,8 +2630,8 @@
       <w:color w:themeColor="accent1" w:themeShade="bf" w:val="2F5496"/>
     </w:rPr>
   </w:style>
-  <w:style w:type="numbering" w:styleId="Semlista" w:default="1">
-    <w:name w:val="Sem lista"/>
+  <w:style w:type="numbering" w:styleId="Semlistauser" w:default="1">
+    <w:name w:val="Sem lista (user)"/>
     <w:uiPriority w:val="99"/>
     <w:semiHidden/>
     <w:unhideWhenUsed/>

</xml_diff>